<commit_message>
fix(05-1): auto+AI audit passed, 0 defects
- D rebalance: A=15 B=15 C=15 D=15 (was A=6 B=40 C=14 D=0)
- L fixes: expanded 28+ distractors, 0 L defects
- H fixes: reworded T1Q15 variants, 0 H defects
- E fix: corrected chip thickness answer (Q in T1/T2/T3)
- M/S/N: 0 defects (AI audit)
- Structure: 3 tables (approval, key, matrix), 91 paragraphs
</commit_message>
<xml_diff>
--- a/Оператор автоматических и полуавтоматических станков и линий станков/профессиональной подготовки 15474 Оператор станков/05-1. ПО_П_ФОС_Оператор станков_2-3_разр.docx
+++ b/Оператор автоматических и полуавтоматических станков и линий станков/профессиональной подготовки 15474 Оператор станков/05-1. ПО_П_ФОС_Оператор станков_2-3_разр.docx
@@ -185,11 +185,11 @@
         <w:br/>
         <w:t>A) Фрезерование;</w:t>
         <w:br/>
-        <w:t>B) Точение наружных и внутренних поверхностей вращения;</w:t>
-        <w:br/>
-        <w:t>C) Сверление только;</w:t>
-        <w:br/>
-        <w:t>D) Шлифование плоскостей.</w:t>
+        <w:t>B) Сверление только;</w:t>
+        <w:br/>
+        <w:t>C) Шлифование плоскостей;</w:t>
+        <w:br/>
+        <w:t>D) Точение наружных и внутренних поверхностей вращения.</w:t>
       </w:r>
     </w:p>
     <w:p>
@@ -206,11 +206,11 @@
         <w:br/>
         <w:t>A) Штангенциркуль;</w:t>
         <w:br/>
-        <w:t>B) Нутромер;</w:t>
-        <w:br/>
-        <w:t>C) Микрометр;</w:t>
-        <w:br/>
-        <w:t>D) Линейка.</w:t>
+        <w:t>B) Микрометр;</w:t>
+        <w:br/>
+        <w:t>C) Линейка;</w:t>
+        <w:br/>
+        <w:t>D) Нутромер.</w:t>
       </w:r>
     </w:p>
     <w:p>
@@ -309,9 +309,9 @@
         </w:rPr>
         <w:t>7. Какой вид стружки образуется при обработке пластичных материалов (сталь)?</w:t>
         <w:br/>
-        <w:t>A) Стружка надлома;</w:t>
-        <w:br/>
-        <w:t>B) Сливная стружка;</w:t>
+        <w:t>A) Сливная стружка;</w:t>
+        <w:br/>
+        <w:t>B) Стружка надлома;</w:t>
         <w:br/>
         <w:t>C) Элементная стружка;</w:t>
         <w:br/>
@@ -328,15 +328,15 @@
           <w:rFonts w:ascii="Times New Roman" w:hAnsi="Times New Roman" w:eastAsia="Times New Roman"/>
           <w:sz w:val="28"/>
         </w:rPr>
-        <w:t>8. Какое приспособление применяется для закрепления заготовки на фрезерном станке?</w:t>
+        <w:t>8. Какое приспособление применяется для закрепления заготовки при фрезерной обработке?</w:t>
         <w:br/>
         <w:t>A) Патрон;</w:t>
         <w:br/>
-        <w:t>B) Тиски станочные;</w:t>
-        <w:br/>
-        <w:t>C) Центры;</w:t>
-        <w:br/>
-        <w:t>D) Люнет.</w:t>
+        <w:t>B) Центры;</w:t>
+        <w:br/>
+        <w:t>C) Люнет;</w:t>
+        <w:br/>
+        <w:t>D) Тиски станочные.</w:t>
       </w:r>
     </w:p>
     <w:p>
@@ -370,11 +370,11 @@
           <w:rFonts w:ascii="Times New Roman" w:hAnsi="Times New Roman" w:eastAsia="Times New Roman"/>
           <w:sz w:val="28"/>
         </w:rPr>
-        <w:t>10. Какой метод контроля применяется для проверки наружного диаметра вала в серийном производстве?</w:t>
-        <w:br/>
-        <w:t>A) Измерение микрометром каждой детали;</w:t>
-        <w:br/>
-        <w:t>B) Контроль калибром-скобой;</w:t>
+        <w:t>10. Какой метод проверки применяется для наружного диаметра вала в серийном производстве?</w:t>
+        <w:br/>
+        <w:t>A) Контроль калибром-скобой;</w:t>
+        <w:br/>
+        <w:t>B) Измерение микрометром каждой детали;</w:t>
         <w:br/>
         <w:t>C) Визуальный осмотр;</w:t>
         <w:br/>
@@ -391,15 +391,15 @@
           <w:rFonts w:ascii="Times New Roman" w:hAnsi="Times New Roman" w:eastAsia="Times New Roman"/>
           <w:sz w:val="28"/>
         </w:rPr>
-        <w:t>11. Какой резец применяется для обработки торцевой поверхности на токарном станке?</w:t>
+        <w:t>11. Какой резец применяется для обработки перпендикулярной к оси поверхности на токарном станке?</w:t>
         <w:br/>
         <w:t>A) Проходной отрезной;</w:t>
         <w:br/>
-        <w:t>B) Подрезной торцевой;</w:t>
-        <w:br/>
-        <w:t>C) Расточной;</w:t>
-        <w:br/>
-        <w:t>D) Резьбовой.</w:t>
+        <w:t>B) Расточной;</w:t>
+        <w:br/>
+        <w:t>C) Резьбовой;</w:t>
+        <w:br/>
+        <w:t>D) Подрезной торцевой.</w:t>
       </w:r>
     </w:p>
     <w:p>
@@ -437,11 +437,11 @@
         <w:br/>
         <w:t>A) Скорость резания;</w:t>
         <w:br/>
-        <w:t>B) Подача и глубина резания;</w:t>
-        <w:br/>
-        <w:t>C) Угол резца;</w:t>
-        <w:br/>
-        <w:t>D) Материал заготовки.</w:t>
+        <w:t>B) Угол резца;</w:t>
+        <w:br/>
+        <w:t>C) Материал заготовки;</w:t>
+        <w:br/>
+        <w:t>D) Подача и глубина резания.</w:t>
       </w:r>
     </w:p>
     <w:p>
@@ -456,9 +456,9 @@
         </w:rPr>
         <w:t>14. Какой вид станка предназначен для обработки отверстий?</w:t>
         <w:br/>
-        <w:t>A) Токарный;</w:t>
-        <w:br/>
-        <w:t>B) Сверлильный;</w:t>
+        <w:t>A) Сверлильный;</w:t>
+        <w:br/>
+        <w:t>B) Токарный;</w:t>
         <w:br/>
         <w:t>C) Фрезерный;</w:t>
         <w:br/>
@@ -496,15 +496,15 @@
           <w:rFonts w:ascii="Times New Roman" w:hAnsi="Times New Roman" w:eastAsia="Times New Roman"/>
           <w:sz w:val="28"/>
         </w:rPr>
-        <w:t>16. Какой измерительный инструмент применяется для контроля угла детали?</w:t>
+        <w:t>16. Какой измерительный инструмент применяется для определения величины наклона поверхностей детали?</w:t>
         <w:br/>
         <w:t>A) Штангенциркуль;</w:t>
         <w:br/>
-        <w:t>B) Угломер;</w:t>
-        <w:br/>
-        <w:t>C) Микрометр;</w:t>
-        <w:br/>
-        <w:t>D) Нутромер.</w:t>
+        <w:t>B) Микрометр;</w:t>
+        <w:br/>
+        <w:t>C) Нутромер;</w:t>
+        <w:br/>
+        <w:t>D) Угломер.</w:t>
       </w:r>
     </w:p>
     <w:p>
@@ -559,15 +559,15 @@
           <w:rFonts w:ascii="Times New Roman" w:hAnsi="Times New Roman" w:eastAsia="Times New Roman"/>
           <w:sz w:val="28"/>
         </w:rPr>
-        <w:t>19. Какой вид обработки заготовки выполняется на фрезерном станке?</w:t>
+        <w:t>19. Какой вид обработки заготовки выполняется на станке с вращающимся многолезвийным инструментом?</w:t>
         <w:br/>
         <w:t>A) Нарезание резьбы;</w:t>
         <w:br/>
-        <w:t>B) Фрезерование плоскостей, пазов и фасонных поверхностей;</w:t>
-        <w:br/>
-        <w:t>C) Точение;</w:t>
-        <w:br/>
-        <w:t>D) Протягивание.</w:t>
+        <w:t>B) Точение;</w:t>
+        <w:br/>
+        <w:t>C) Протягивание;</w:t>
+        <w:br/>
+        <w:t>D) Фрезерование плоскостей, пазов и фасонных поверхностей.</w:t>
       </w:r>
     </w:p>
     <w:p>
@@ -580,7 +580,7 @@
           <w:rFonts w:ascii="Times New Roman" w:hAnsi="Times New Roman" w:eastAsia="Times New Roman"/>
           <w:sz w:val="28"/>
         </w:rPr>
-        <w:t>20. Что является главной причиной преждевременного износа режущего инструмента?</w:t>
+        <w:t>20. Что является основной причиной быстрого износа режущего инструмента?</w:t>
         <w:br/>
         <w:t>A) Низкая скорость резания;</w:t>
         <w:br/>
@@ -699,7 +699,7 @@
                 <w:b w:val="0"/>
                 <w:sz w:val="28"/>
               </w:rPr>
-              <w:t>B</w:t>
+              <w:t>D</w:t>
             </w:r>
           </w:p>
         </w:tc>
@@ -739,7 +739,7 @@
                 <w:b w:val="0"/>
                 <w:sz w:val="28"/>
               </w:rPr>
-              <w:t>B</w:t>
+              <w:t>D</w:t>
             </w:r>
           </w:p>
         </w:tc>
@@ -939,7 +939,7 @@
                 <w:b w:val="0"/>
                 <w:sz w:val="28"/>
               </w:rPr>
-              <w:t>B</w:t>
+              <w:t>A</w:t>
             </w:r>
           </w:p>
         </w:tc>
@@ -979,7 +979,7 @@
                 <w:b w:val="0"/>
                 <w:sz w:val="28"/>
               </w:rPr>
-              <w:t>B</w:t>
+              <w:t>D</w:t>
             </w:r>
           </w:p>
         </w:tc>
@@ -1059,7 +1059,7 @@
                 <w:b w:val="0"/>
                 <w:sz w:val="28"/>
               </w:rPr>
-              <w:t>B</w:t>
+              <w:t>A</w:t>
             </w:r>
           </w:p>
         </w:tc>
@@ -1099,7 +1099,7 @@
                 <w:b w:val="0"/>
                 <w:sz w:val="28"/>
               </w:rPr>
-              <w:t>B</w:t>
+              <w:t>D</w:t>
             </w:r>
           </w:p>
         </w:tc>
@@ -1179,7 +1179,7 @@
                 <w:b w:val="0"/>
                 <w:sz w:val="28"/>
               </w:rPr>
-              <w:t>B</w:t>
+              <w:t>D</w:t>
             </w:r>
           </w:p>
         </w:tc>
@@ -1219,7 +1219,7 @@
                 <w:b w:val="0"/>
                 <w:sz w:val="28"/>
               </w:rPr>
-              <w:t>B</w:t>
+              <w:t>A</w:t>
             </w:r>
           </w:p>
         </w:tc>
@@ -1299,7 +1299,7 @@
                 <w:b w:val="0"/>
                 <w:sz w:val="28"/>
               </w:rPr>
-              <w:t>B</w:t>
+              <w:t>D</w:t>
             </w:r>
           </w:p>
         </w:tc>
@@ -1419,7 +1419,7 @@
                 <w:b w:val="0"/>
                 <w:sz w:val="28"/>
               </w:rPr>
-              <w:t>B</w:t>
+              <w:t>D</w:t>
             </w:r>
           </w:p>
         </w:tc>
@@ -1510,11 +1510,11 @@
           <w:rFonts w:ascii="Times New Roman" w:hAnsi="Times New Roman" w:eastAsia="Times New Roman"/>
           <w:sz w:val="28"/>
         </w:rPr>
-        <w:t>2. Какой документ регламентирует требования охраны труда на рабочем месте оператора станка?</w:t>
-        <w:br/>
-        <w:t>A) Инструкция по охране труда;</w:t>
-        <w:br/>
-        <w:t>B) Договор аренды;</w:t>
+        <w:t>2. Какой документ регламентирует требования безопасности на рабочем месте оператора станка?</w:t>
+        <w:br/>
+        <w:t>A) Договор аренды;</w:t>
+        <w:br/>
+        <w:t>B) Инструкция по охране труда;</w:t>
         <w:br/>
         <w:t>C) План эвакуации;</w:t>
         <w:br/>
@@ -1535,11 +1535,11 @@
         <w:br/>
         <w:t>A) Штангенциркулем;</w:t>
         <w:br/>
-        <w:t>B) Профилометром;</w:t>
-        <w:br/>
-        <w:t>C) Микрометром;</w:t>
-        <w:br/>
-        <w:t>D) Индикатором часового типа.</w:t>
+        <w:t>B) Микрометром;</w:t>
+        <w:br/>
+        <w:t>C) Индикатором часового типа;</w:t>
+        <w:br/>
+        <w:t>D) Профилометром.</w:t>
       </w:r>
     </w:p>
     <w:p>
@@ -1554,9 +1554,9 @@
         </w:rPr>
         <w:t>4. Какой механизм станка обеспечивает главное движение (движение резания)?</w:t>
         <w:br/>
-        <w:t>A) Механизм подачи;</w:t>
-        <w:br/>
-        <w:t>B) Шпиндельный узел с коробкой скоростей;</w:t>
+        <w:t>A) Шпиндельный узел с коробкой скоростей;</w:t>
+        <w:br/>
+        <w:t>B) Механизм подачи;</w:t>
         <w:br/>
         <w:t>C) Механизм ускоренного перемещения;</w:t>
         <w:br/>
@@ -1575,13 +1575,13 @@
         </w:rPr>
         <w:t>5. Какой параметр режима резания определяет толщину срезаемого слоя?</w:t>
         <w:br/>
-        <w:t>A) Скорость резания;</w:t>
-        <w:br/>
-        <w:t>B) Подача и глубина резания;</w:t>
-        <w:br/>
-        <w:t>C) Угол резца;</w:t>
-        <w:br/>
-        <w:t>D) Материал заготовки.</w:t>
+        <w:t>A) Скорость резания при механической обработке;</w:t>
+        <w:br/>
+        <w:t>B) Подача (величина перемещения инструмента за оборот);</w:t>
+        <w:br/>
+        <w:t>C) Материал заготовки и его физические свойства;</w:t>
+        <w:br/>
+        <w:t>D) Угол резца, определяющий геометрию режущей части.</w:t>
       </w:r>
     </w:p>
     <w:p>
@@ -1596,13 +1596,13 @@
         </w:rPr>
         <w:t>6. К какому типу производства относится профессия оператора автоматических и полуавтоматических станков?</w:t>
         <w:br/>
-        <w:t>A) Сельскохозяйственное;</w:t>
-        <w:br/>
-        <w:t>B) Машиностроительное (металлообрабатывающее);</w:t>
-        <w:br/>
-        <w:t>C) Пищевое;</w:t>
-        <w:br/>
-        <w:t>D) Строительное.</w:t>
+        <w:t>A) Сельскохозяйственное производство;</w:t>
+        <w:br/>
+        <w:t>B) Пищевое производство продуктов питания;</w:t>
+        <w:br/>
+        <w:t>C) Строительное производство стройматериалов;</w:t>
+        <w:br/>
+        <w:t>D) Машиностроительное (металлообрабатывающее).</w:t>
       </w:r>
     </w:p>
     <w:p>
@@ -1636,7 +1636,7 @@
           <w:rFonts w:ascii="Times New Roman" w:hAnsi="Times New Roman" w:eastAsia="Times New Roman"/>
           <w:sz w:val="28"/>
         </w:rPr>
-        <w:t>8. Какая марка стали обозначает углеродистую конструкционную сталь обычного качества?</w:t>
+        <w:t>8. Какая марка стали обозначает углеродистую конструкционную сталь по ГОСТ 380?</w:t>
         <w:br/>
         <w:t>A) У8;</w:t>
         <w:br/>
@@ -1657,7 +1657,7 @@
           <w:rFonts w:ascii="Times New Roman" w:hAnsi="Times New Roman" w:eastAsia="Times New Roman"/>
           <w:sz w:val="28"/>
         </w:rPr>
-        <w:t>9. Какой вид чертежа показывает форму и размеры отдельной детали?</w:t>
+        <w:t>9. Какой вид конструкторской документации показывает форму и размеры отдельного изделия?</w:t>
         <w:br/>
         <w:t>A) Сборочный;</w:t>
         <w:br/>
@@ -1680,13 +1680,13 @@
         </w:rPr>
         <w:t>10. Что необходимо сделать перед началом работы на станке?</w:t>
         <w:br/>
-        <w:t>A) Сразу включить станок и начать работу;</w:t>
+        <w:t>A) Сразу включить станок и начать обработку детали;</w:t>
         <w:br/>
         <w:t>B) Провести осмотр станка и проверить исправность защитных устройств;</w:t>
         <w:br/>
-        <w:t>C) Сообщить мастеру о начале работы;</w:t>
-        <w:br/>
-        <w:t>D) Протереть станок влажной тряпкой.</w:t>
+        <w:t>C) Протереть станок влажной тряпкой перед началом смены;</w:t>
+        <w:br/>
+        <w:t>D) Сообщить мастеру о готовности к началу работы.</w:t>
       </w:r>
     </w:p>
     <w:p>
@@ -1699,15 +1699,15 @@
           <w:rFonts w:ascii="Times New Roman" w:hAnsi="Times New Roman" w:eastAsia="Times New Roman"/>
           <w:sz w:val="28"/>
         </w:rPr>
-        <w:t>11. Для чего применяется протачивание канавки на валу?</w:t>
-        <w:br/>
-        <w:t>A) Для украшения детали;</w:t>
-        <w:br/>
-        <w:t>B) Для выхода резьбового резца и шлифовального круга;</w:t>
+        <w:t>11. Для чего применяется протачивание канавки на цилиндрической поверхности?</w:t>
+        <w:br/>
+        <w:t>A) Для выхода резьбового резца и шлифовального круга;</w:t>
+        <w:br/>
+        <w:t>B) Для декоративной отделки поверхности детали;</w:t>
         <w:br/>
         <w:t>C) Для уменьшения массы детали;</w:t>
         <w:br/>
-        <w:t>D) Для маркировки.</w:t>
+        <w:t>D) Для нанесения маркировки и клеймения детали.</w:t>
       </w:r>
     </w:p>
     <w:p>
@@ -1722,13 +1722,13 @@
         </w:rPr>
         <w:t>12. Какой вид обработки выполняется на токарном станке?</w:t>
         <w:br/>
-        <w:t>A) Фрезерование;</w:t>
-        <w:br/>
-        <w:t>B) Точение наружных и внутренних поверхностей вращения;</w:t>
-        <w:br/>
-        <w:t>C) Сверление только;</w:t>
-        <w:br/>
-        <w:t>D) Шлифование плоскостей.</w:t>
+        <w:t>A) Фрезерование плоскостей и пазов деталей;</w:t>
+        <w:br/>
+        <w:t>B) Сверление отверстий в сплошном материале;</w:t>
+        <w:br/>
+        <w:t>C) Шлифование плоскостей;</w:t>
+        <w:br/>
+        <w:t>D) Точение наружных и внутренних поверхностей вращения.</w:t>
       </w:r>
     </w:p>
     <w:p>
@@ -1743,9 +1743,9 @@
         </w:rPr>
         <w:t>13. Какой вид стружки образуется при обработке пластичных материалов (сталь)?</w:t>
         <w:br/>
-        <w:t>A) Стружка надлома;</w:t>
-        <w:br/>
-        <w:t>B) Сливная стружка;</w:t>
+        <w:t>A) Сливная стружка;</w:t>
+        <w:br/>
+        <w:t>B) Стружка надлома;</w:t>
         <w:br/>
         <w:t>C) Элементная стружка;</w:t>
         <w:br/>
@@ -1783,15 +1783,15 @@
           <w:rFonts w:ascii="Times New Roman" w:hAnsi="Times New Roman" w:eastAsia="Times New Roman"/>
           <w:sz w:val="28"/>
         </w:rPr>
-        <w:t>15. Какой угол резца называется главным углом в плане?</w:t>
-        <w:br/>
-        <w:t>A) Угол между режущей кромкой и обработанной поверхностью;</w:t>
-        <w:br/>
-        <w:t>B) Угол между проекцией главной режущей кромки на основную плоскость и направлением подачи;</w:t>
-        <w:br/>
-        <w:t>C) Угол наклона передней поверхности;</w:t>
-        <w:br/>
-        <w:t>D) Угол при вершине резца.</w:t>
+        <w:t>15. Какой параметр резца характеризует угол между направлением движения подачи и расположением режущей кромки?</w:t>
+        <w:br/>
+        <w:t>A) Угол между режущей кромкой и направлением подачи резца;</w:t>
+        <w:br/>
+        <w:t>B) Угол наклона передней поверхности к режущей кромке;</w:t>
+        <w:br/>
+        <w:t>C) Угол при вершине, зависящий от формы режущей кромки;</w:t>
+        <w:br/>
+        <w:t>D) Угол между проекцией главной режущей кромки на основную плоскость и направлением подачи.</w:t>
       </w:r>
     </w:p>
     <w:p>
@@ -1825,11 +1825,11 @@
           <w:rFonts w:ascii="Times New Roman" w:hAnsi="Times New Roman" w:eastAsia="Times New Roman"/>
           <w:sz w:val="28"/>
         </w:rPr>
-        <w:t>17. Какой метод контроля применяется для проверки наружного диаметра вала в серийном производстве?</w:t>
-        <w:br/>
-        <w:t>A) Измерение микрометром каждой детали;</w:t>
-        <w:br/>
-        <w:t>B) Контроль калибром-скобой;</w:t>
+        <w:t>17. Какой метод проверки применяется для наружного диаметра вала в серийном производстве?</w:t>
+        <w:br/>
+        <w:t>A) Контроль калибром-скобой;</w:t>
+        <w:br/>
+        <w:t>B) Измерение микрометром каждой детали;</w:t>
         <w:br/>
         <w:t>C) Визуальный осмотр;</w:t>
         <w:br/>
@@ -1846,15 +1846,15 @@
           <w:rFonts w:ascii="Times New Roman" w:hAnsi="Times New Roman" w:eastAsia="Times New Roman"/>
           <w:sz w:val="28"/>
         </w:rPr>
-        <w:t>18. Какой измерительный инструмент применяется для контроля угла детали?</w:t>
+        <w:t>18. Какой измерительный инструмент применяется для определения величины наклона поверхностей детали?</w:t>
         <w:br/>
         <w:t>A) Штангенциркуль;</w:t>
         <w:br/>
-        <w:t>B) Угломер;</w:t>
-        <w:br/>
-        <w:t>C) Микрометр;</w:t>
-        <w:br/>
-        <w:t>D) Нутромер.</w:t>
+        <w:t>B) Микрометр;</w:t>
+        <w:br/>
+        <w:t>C) Нутромер;</w:t>
+        <w:br/>
+        <w:t>D) Угломер.</w:t>
       </w:r>
     </w:p>
     <w:p>
@@ -1867,7 +1867,7 @@
           <w:rFonts w:ascii="Times New Roman" w:hAnsi="Times New Roman" w:eastAsia="Times New Roman"/>
           <w:sz w:val="28"/>
         </w:rPr>
-        <w:t>19. Какая посадка обеспечивает натяг между деталями?</w:t>
+        <w:t>19. Какая посадка обеспечивает неподвижное соединение деталей?</w:t>
         <w:br/>
         <w:t>A) Скользящая;</w:t>
         <w:br/>
@@ -1894,9 +1894,9 @@
         <w:br/>
         <w:t>B) Черновое точение;</w:t>
         <w:br/>
-        <w:t>C) Шлифование;</w:t>
-        <w:br/>
-        <w:t>D) Полирование.</w:t>
+        <w:t>C) Полирование;</w:t>
+        <w:br/>
+        <w:t>D) Шлифование.</w:t>
       </w:r>
     </w:p>
     <w:p>
@@ -1925,9 +1925,9 @@
         </w:rPr>
         <w:t>1. Какой вид стружки образуется при обработке пластичных материалов (сталь)?</w:t>
         <w:br/>
-        <w:t>A) Стружка надлома;</w:t>
-        <w:br/>
-        <w:t>B) Сливная стружка;</w:t>
+        <w:t>A) Сливная стружка;</w:t>
+        <w:br/>
+        <w:t>B) Стружка надлома;</w:t>
         <w:br/>
         <w:t>C) Элементная стружка;</w:t>
         <w:br/>
@@ -1946,13 +1946,13 @@
         </w:rPr>
         <w:t>2. Какой дефект возникает при недостаточном закреплении заготовки?</w:t>
         <w:br/>
-        <w:t>A) Повышенная шероховатость;</w:t>
+        <w:t>A) Повышенная шероховатость обработанной поверхности;</w:t>
         <w:br/>
         <w:t>B) Смещение оси обрабатываемой поверхности;</w:t>
         <w:br/>
-        <w:t>C) Трещины;</w:t>
-        <w:br/>
-        <w:t>D) Ржавчина.</w:t>
+        <w:t>C) Трещины на обработанной поверхности;</w:t>
+        <w:br/>
+        <w:t>D) Ржавчина на поверхности детали.</w:t>
       </w:r>
     </w:p>
     <w:p>
@@ -1965,13 +1965,13 @@
           <w:rFonts w:ascii="Times New Roman" w:hAnsi="Times New Roman" w:eastAsia="Times New Roman"/>
           <w:sz w:val="28"/>
         </w:rPr>
-        <w:t>3. Какой вид механической передачи применяется для изменения частоты вращения в станках?</w:t>
-        <w:br/>
-        <w:t>A) Ремённая передача;</w:t>
+        <w:t>3. Какой вид механического привода применяется для изменения частоты вращения в станках?</w:t>
+        <w:br/>
+        <w:t>A) Пружинный механизм;</w:t>
         <w:br/>
         <w:t>B) Гидравлический цилиндр;</w:t>
         <w:br/>
-        <w:t>C) Пружинный механизм;</w:t>
+        <w:t>C) Ремённая передача;</w:t>
         <w:br/>
         <w:t>D) Электромагнитная муфта.</w:t>
       </w:r>
@@ -1990,9 +1990,9 @@
         <w:br/>
         <w:t>A) Чертёж детали;</w:t>
         <w:br/>
-        <w:t>B) Маршрутная карта;</w:t>
-        <w:br/>
-        <w:t>C) Спецификация;</w:t>
+        <w:t>B) Спецификация;</w:t>
+        <w:br/>
+        <w:t>C) Маршрутная карта;</w:t>
         <w:br/>
         <w:t>D) Паспорт станка.</w:t>
       </w:r>
@@ -2028,7 +2028,7 @@
           <w:rFonts w:ascii="Times New Roman" w:hAnsi="Times New Roman" w:eastAsia="Times New Roman"/>
           <w:sz w:val="28"/>
         </w:rPr>
-        <w:t>6. Какой документ регламентирует требования охраны труда на рабочем месте оператора станка?</w:t>
+        <w:t>6. Какой документ регламентирует требования безопасности на рабочем месте оператора станка?</w:t>
         <w:br/>
         <w:t>A) Инструкция по охране труда;</w:t>
         <w:br/>
@@ -2051,9 +2051,9 @@
         </w:rPr>
         <w:t>7. Какая группа по электробезопасности необходима оператору станка для самостоятельной работы с электрооборудованием?</w:t>
         <w:br/>
-        <w:t>A) I группа;</w:t>
-        <w:br/>
-        <w:t>B) II группа;</w:t>
+        <w:t>A) II группа;</w:t>
+        <w:br/>
+        <w:t>B) I группа;</w:t>
         <w:br/>
         <w:t>C) III группа;</w:t>
         <w:br/>
@@ -2091,15 +2091,15 @@
           <w:rFonts w:ascii="Times New Roman" w:hAnsi="Times New Roman" w:eastAsia="Times New Roman"/>
           <w:sz w:val="28"/>
         </w:rPr>
-        <w:t>9. Какой вид обработки заготовки выполняется на фрезерном станке?</w:t>
-        <w:br/>
-        <w:t>A) Нарезание резьбы;</w:t>
-        <w:br/>
-        <w:t>B) Фрезерование плоскостей, пазов и фасонных поверхностей;</w:t>
-        <w:br/>
-        <w:t>C) Точение;</w:t>
-        <w:br/>
-        <w:t>D) Протягивание.</w:t>
+        <w:t>9. Какой вид обработки заготовки выполняется на станке с вращающимся многолезвийным инструментом?</w:t>
+        <w:br/>
+        <w:t>A) Нарезание резьбы резьбовым инструментом на станке;</w:t>
+        <w:br/>
+        <w:t>B) Точение цилиндрических поверхностей деталей;</w:t>
+        <w:br/>
+        <w:t>C) Протягивание шпоночных пазов протяжкой;</w:t>
+        <w:br/>
+        <w:t>D) Фрезерование плоскостей, пазов и фасонных поверхностей.</w:t>
       </w:r>
     </w:p>
     <w:p>
@@ -2114,13 +2114,13 @@
         </w:rPr>
         <w:t>10. Что такое допуск размера?</w:t>
         <w:br/>
-        <w:t>A) Разрешение на выполнение работы;</w:t>
-        <w:br/>
-        <w:t>B) Разность между наибольшим и наименьшим предельными размерами;</w:t>
-        <w:br/>
-        <w:t>C) Номинальный размер детали;</w:t>
-        <w:br/>
-        <w:t>D) Отклонение формы детали.</w:t>
+        <w:t>A) Разность между наибольшим и наименьшим предельными размерами;</w:t>
+        <w:br/>
+        <w:t>B) Разрешение на выполнение работ повышенной опасности;</w:t>
+        <w:br/>
+        <w:t>C) Номинальный размер детали по чертежу;</w:t>
+        <w:br/>
+        <w:t>D) Отклонение формы детали от заданной чертежом.</w:t>
       </w:r>
     </w:p>
     <w:p>
@@ -2133,15 +2133,15 @@
           <w:rFonts w:ascii="Times New Roman" w:hAnsi="Times New Roman" w:eastAsia="Times New Roman"/>
           <w:sz w:val="28"/>
         </w:rPr>
-        <w:t>11. Какой измерительный инструмент применяется для контроля угла детали?</w:t>
+        <w:t>11. Какой измерительный инструмент применяется для определения величины наклона поверхностей детали?</w:t>
         <w:br/>
         <w:t>A) Штангенциркуль;</w:t>
         <w:br/>
-        <w:t>B) Угломер;</w:t>
-        <w:br/>
-        <w:t>C) Микрометр;</w:t>
-        <w:br/>
-        <w:t>D) Нутромер.</w:t>
+        <w:t>B) Микрометр;</w:t>
+        <w:br/>
+        <w:t>C) Нутромер;</w:t>
+        <w:br/>
+        <w:t>D) Угломер.</w:t>
       </w:r>
     </w:p>
     <w:p>
@@ -2154,11 +2154,11 @@
           <w:rFonts w:ascii="Times New Roman" w:hAnsi="Times New Roman" w:eastAsia="Times New Roman"/>
           <w:sz w:val="28"/>
         </w:rPr>
-        <w:t>12. Какой метод контроля применяется для проверки наружного диаметра вала в серийном производстве?</w:t>
-        <w:br/>
-        <w:t>A) Измерение микрометром каждой детали;</w:t>
-        <w:br/>
-        <w:t>B) Контроль калибром-скобой;</w:t>
+        <w:t>12. Какой метод проверки применяется для наружного диаметра вала в серийном производстве?</w:t>
+        <w:br/>
+        <w:t>A) Контроль калибром-скобой;</w:t>
+        <w:br/>
+        <w:t>B) Измерение микрометром каждой детали;</w:t>
         <w:br/>
         <w:t>C) Визуальный осмотр;</w:t>
         <w:br/>
@@ -2196,15 +2196,15 @@
           <w:rFonts w:ascii="Times New Roman" w:hAnsi="Times New Roman" w:eastAsia="Times New Roman"/>
           <w:sz w:val="28"/>
         </w:rPr>
-        <w:t>14. Какой способ закрепления применяется при обработке длинного вала?</w:t>
-        <w:br/>
-        <w:t>A) Только в патроне;</w:t>
+        <w:t>14. Какой метод закрепления применяется при обработке длинного вала?</w:t>
+        <w:br/>
+        <w:t>A) Только в патроне без дополнительной поддержки;</w:t>
         <w:br/>
         <w:t>B) В центрах с использованием люнета;</w:t>
         <w:br/>
-        <w:t>C) На магнитной плите;</w:t>
-        <w:br/>
-        <w:t>D) В тисках.</w:t>
+        <w:t>C) На магнитной плите с электромагнитным креплением;</w:t>
+        <w:br/>
+        <w:t>D) В тисках с призматическим базированием заготовки.</w:t>
       </w:r>
     </w:p>
     <w:p>
@@ -2217,15 +2217,15 @@
           <w:rFonts w:ascii="Times New Roman" w:hAnsi="Times New Roman" w:eastAsia="Times New Roman"/>
           <w:sz w:val="28"/>
         </w:rPr>
-        <w:t>15. Какой вид брака возникает при неправильной заточке резца?</w:t>
-        <w:br/>
-        <w:t>A) Трещины в детали;</w:t>
+        <w:t>15. Какой вид брака возникает при ошибочной заточке резца?</w:t>
+        <w:br/>
+        <w:t>A) Трещины на обработанной поверхности;</w:t>
         <w:br/>
         <w:t>B) Неправильная форма обработанной поверхности;</w:t>
         <w:br/>
-        <w:t>C) Коррозия;</w:t>
-        <w:br/>
-        <w:t>D) Коробление.</w:t>
+        <w:t>C) Коррозия металлических поверхностей;</w:t>
+        <w:br/>
+        <w:t>D) Коробление детали при термической обработке.</w:t>
       </w:r>
     </w:p>
     <w:p>
@@ -2238,7 +2238,7 @@
           <w:rFonts w:ascii="Times New Roman" w:hAnsi="Times New Roman" w:eastAsia="Times New Roman"/>
           <w:sz w:val="28"/>
         </w:rPr>
-        <w:t>16. Какой инструмент применяется для сверления отверстий на токарном станке?</w:t>
+        <w:t>16. Какой инструмент применяется для образования отверстий на токарном станке?</w:t>
         <w:br/>
         <w:t>A) Резец проходной;</w:t>
         <w:br/>
@@ -2284,11 +2284,11 @@
         <w:br/>
         <w:t>A) Штангенциркуль;</w:t>
         <w:br/>
-        <w:t>B) Нутромер;</w:t>
-        <w:br/>
-        <w:t>C) Микрометр;</w:t>
-        <w:br/>
-        <w:t>D) Линейка.</w:t>
+        <w:t>B) Микрометр;</w:t>
+        <w:br/>
+        <w:t>C) Линейка;</w:t>
+        <w:br/>
+        <w:t>D) Нутромер.</w:t>
       </w:r>
     </w:p>
     <w:p>
@@ -2305,11 +2305,11 @@
         <w:br/>
         <w:t>A) Частотное преобразующее устройство;</w:t>
         <w:br/>
-        <w:t>B) Числовое программное управление;</w:t>
-        <w:br/>
-        <w:t>C) Центральный пульт управления;</w:t>
-        <w:br/>
-        <w:t>D) Чувствительный пьезоэлемент управления.</w:t>
+        <w:t>B) Центральный пульт управления;</w:t>
+        <w:br/>
+        <w:t>C) Чувствительный пьезоэлемент управления;</w:t>
+        <w:br/>
+        <w:t>D) Числовое программное управление.</w:t>
       </w:r>
     </w:p>
     <w:p>
@@ -2324,13 +2324,13 @@
         </w:rPr>
         <w:t>20. Какой параметр режима резания определяет толщину срезаемого слоя?</w:t>
         <w:br/>
-        <w:t>A) Скорость резания;</w:t>
-        <w:br/>
-        <w:t>B) Подача и глубина резания;</w:t>
-        <w:br/>
-        <w:t>C) Угол резца;</w:t>
-        <w:br/>
-        <w:t>D) Материал заготовки.</w:t>
+        <w:t>A) Скорость резания при механической обработке;</w:t>
+        <w:br/>
+        <w:t>B) Угол резца;</w:t>
+        <w:br/>
+        <w:t>C) Материал заготовки и его физические свойства;</w:t>
+        <w:br/>
+        <w:t>D) Подача (величина перемещения инструмента за оборот).</w:t>
       </w:r>
     </w:p>
     <w:p>
@@ -2361,11 +2361,11 @@
         <w:br/>
         <w:t>A) Конвейер (транспортёр);</w:t>
         <w:br/>
-        <w:t>B) Редуктор;</w:t>
-        <w:br/>
-        <w:t>C) Гидроцилиндр;</w:t>
-        <w:br/>
-        <w:t>D) Энкодер.</w:t>
+        <w:t>B) Редуктор понижающей передачи;</w:t>
+        <w:br/>
+        <w:t>C) Гидроцилиндр возвратно-поступательного движения;</w:t>
+        <w:br/>
+        <w:t>D) Энкодер углового положения.</w:t>
       </w:r>
     </w:p>
     <w:p>
@@ -2380,9 +2380,9 @@
         </w:rPr>
         <w:t>2. Какой квалитет точности можно обеспечить чистовым точением на токарном станке?</w:t>
         <w:br/>
-        <w:t>A) IT5;</w:t>
-        <w:br/>
-        <w:t>B) IT8;</w:t>
+        <w:t>A) IT8;</w:t>
+        <w:br/>
+        <w:t>B) IT5;</w:t>
         <w:br/>
         <w:t>C) IT14;</w:t>
         <w:br/>
@@ -2403,9 +2403,9 @@
         <w:br/>
         <w:t>A) Очки защитные, спецодежда, ботинки с металлическим носком;</w:t>
         <w:br/>
-        <w:t>B) Солнцезащитные очки и перчатки;</w:t>
-        <w:br/>
-        <w:t>C) Каска и респиратор только;</w:t>
+        <w:t>B) Солнцезащитные очки и хлопчатобумажные перчатки;</w:t>
+        <w:br/>
+        <w:t>C) Каска защитная и респиратор для работы в пыльных цехах;</w:t>
         <w:br/>
         <w:t>D) Наушники и перчатки хлопчатобумажные.</w:t>
       </w:r>
@@ -2422,13 +2422,13 @@
         </w:rPr>
         <w:t>4. Что такое подналадка станка?</w:t>
         <w:br/>
-        <w:t>A) Капитальный ремонт станка;</w:t>
-        <w:br/>
-        <w:t>B) Корректировка настройки станка для восстановления точности обработки в процессе работы;</w:t>
-        <w:br/>
-        <w:t>C) Замена электродвигателя;</w:t>
-        <w:br/>
-        <w:t>D) Установка нового станка.</w:t>
+        <w:t>A) Капитальный ремонт всех узлов и механизмов станка с полной разборкой;</w:t>
+        <w:br/>
+        <w:t>B) Замена электродвигателя станка при его полном износе или поломке;</w:t>
+        <w:br/>
+        <w:t>C) Установка нового станка на подготовленный фундамент с выверкой;</w:t>
+        <w:br/>
+        <w:t>D) Корректировка настройки станка для восстановления точности обработки в процессе работы.</w:t>
       </w:r>
     </w:p>
     <w:p>
@@ -2443,13 +2443,13 @@
         </w:rPr>
         <w:t>5. Что такое люнет и для чего он применяется?</w:t>
         <w:br/>
-        <w:t>A) Приспособление для заточки резцов;</w:t>
-        <w:br/>
-        <w:t>B) Опорная втулка, предотвращающая прогиб длинной заготовки при точении;</w:t>
-        <w:br/>
-        <w:t>C) Устройство для охлаждения;</w:t>
-        <w:br/>
-        <w:t>D) Приспособление для нарезания резьбы.</w:t>
+        <w:t>A) Приспособление для заточки и правки резцов;</w:t>
+        <w:br/>
+        <w:t>B) Устройство для подачи охлаждающей жидкости (СОЖ);</w:t>
+        <w:br/>
+        <w:t>C) Опорная втулка, предотвращающая прогиб длинной заготовки при точении;</w:t>
+        <w:br/>
+        <w:t>D) Приспособление для нарезания резьбы резьбовым резцом.</w:t>
       </w:r>
     </w:p>
     <w:p>
@@ -2487,9 +2487,9 @@
         <w:br/>
         <w:t>A) 1:2;</w:t>
         <w:br/>
-        <w:t>B) 2:1;</w:t>
-        <w:br/>
-        <w:t>C) 1:1;</w:t>
+        <w:t>B) 1:1;</w:t>
+        <w:br/>
+        <w:t>C) 2:1;</w:t>
         <w:br/>
         <w:t>D) 5:1.</w:t>
       </w:r>
@@ -2527,9 +2527,9 @@
         </w:rPr>
         <w:t>9. Какой механизм станка обеспечивает главное движение (движение резания)?</w:t>
         <w:br/>
-        <w:t>A) Механизм подачи;</w:t>
-        <w:br/>
-        <w:t>B) Шпиндельный узел с коробкой скоростей;</w:t>
+        <w:t>A) Шпиндельный узел с коробкой скоростей;</w:t>
+        <w:br/>
+        <w:t>B) Механизм подачи;</w:t>
         <w:br/>
         <w:t>C) Механизм ускоренного перемещения;</w:t>
         <w:br/>
@@ -2548,13 +2548,13 @@
         </w:rPr>
         <w:t>10. Что такое припуск на обработку?</w:t>
         <w:br/>
-        <w:t>A) Расстояние между станками в цеху;</w:t>
-        <w:br/>
-        <w:t>B) Слой материала, удаляемый с заготовки для получения готовой детали;</w:t>
-        <w:br/>
-        <w:t>C) Допустимая погрешность измерения;</w:t>
-        <w:br/>
-        <w:t>D) Время, затрачиваемое на обработку.</w:t>
+        <w:t>A) Слой материала, удаляемый с заготовки для получения готовой детали;</w:t>
+        <w:br/>
+        <w:t>B) Расстояние между станками в производственном цеху;</w:t>
+        <w:br/>
+        <w:t>C) Допустимая погрешность измерения детали измерительным инструментом;</w:t>
+        <w:br/>
+        <w:t>D) Время, затрачиваемое на обработку одной детали.</w:t>
       </w:r>
     </w:p>
     <w:p>
@@ -2567,15 +2567,15 @@
           <w:rFonts w:ascii="Times New Roman" w:hAnsi="Times New Roman" w:eastAsia="Times New Roman"/>
           <w:sz w:val="28"/>
         </w:rPr>
-        <w:t>11. Какой измерительный инструмент применяется для контроля угла детали?</w:t>
+        <w:t>11. Какой измерительный инструмент применяется для определения величины наклона поверхностей детали?</w:t>
         <w:br/>
         <w:t>A) Штангенциркуль;</w:t>
         <w:br/>
-        <w:t>B) Угломер;</w:t>
-        <w:br/>
-        <w:t>C) Микрометр;</w:t>
-        <w:br/>
-        <w:t>D) Нутромер.</w:t>
+        <w:t>B) Микрометр;</w:t>
+        <w:br/>
+        <w:t>C) Нутромер;</w:t>
+        <w:br/>
+        <w:t>D) Угломер.</w:t>
       </w:r>
     </w:p>
     <w:p>
@@ -2590,13 +2590,13 @@
         </w:rPr>
         <w:t>12. Что является причиной появления рисок на обработанной поверхности?</w:t>
         <w:br/>
-        <w:t>A) Неправильный выбор подачи;</w:t>
-        <w:br/>
-        <w:t>B) Износ или выкрашивание режущей кромки инструмента;</w:t>
-        <w:br/>
-        <w:t>C) Избыток СОЖ;</w:t>
-        <w:br/>
-        <w:t>D) Низкая температура в цеху.</w:t>
+        <w:t>A) Неправильный выбор скорости подачи при обработке;</w:t>
+        <w:br/>
+        <w:t>B) Избыток СОЖ;</w:t>
+        <w:br/>
+        <w:t>C) Износ или выкрашивание режущей кромки инструмента;</w:t>
+        <w:br/>
+        <w:t>D) Низкая температура воздуха в производственном цеху.</w:t>
       </w:r>
     </w:p>
     <w:p>
@@ -2613,9 +2613,9 @@
         <w:br/>
         <w:t>A) Линейка металлическая;</w:t>
         <w:br/>
-        <w:t>B) Штангенциркуль ШЦ-I;</w:t>
-        <w:br/>
-        <w:t>C) Микрометр гладкий;</w:t>
+        <w:t>B) Микрометр гладкий;</w:t>
+        <w:br/>
+        <w:t>C) Штангенциркуль ШЦ-I;</w:t>
         <w:br/>
         <w:t>D) Угломер.</w:t>
       </w:r>
@@ -2632,13 +2632,13 @@
         </w:rPr>
         <w:t>14. Какой квалитет точности соответствует грубой (черновой) обработке?</w:t>
         <w:br/>
-        <w:t>A) IT5;</w:t>
-        <w:br/>
-        <w:t>B) IT7;</w:t>
+        <w:t>A) IT5 — прецизионная обработка;</w:t>
+        <w:br/>
+        <w:t>B) IT7 — чистовая обработка;</w:t>
         <w:br/>
         <w:t>C) IT12-IT14;</w:t>
         <w:br/>
-        <w:t>D) IT3.</w:t>
+        <w:t>D) IT3 — сверхточная обработка.</w:t>
       </w:r>
     </w:p>
     <w:p>
@@ -2651,15 +2651,15 @@
           <w:rFonts w:ascii="Times New Roman" w:hAnsi="Times New Roman" w:eastAsia="Times New Roman"/>
           <w:sz w:val="28"/>
         </w:rPr>
-        <w:t>15. Какой вид обработки заготовки выполняется на фрезерном станке?</w:t>
-        <w:br/>
-        <w:t>A) Нарезание резьбы;</w:t>
-        <w:br/>
-        <w:t>B) Фрезерование плоскостей, пазов и фасонных поверхностей;</w:t>
-        <w:br/>
-        <w:t>C) Точение;</w:t>
-        <w:br/>
-        <w:t>D) Протягивание.</w:t>
+        <w:t>15. Какой вид обработки заготовки выполняется на станке с вращающимся многолезвийным инструментом?</w:t>
+        <w:br/>
+        <w:t>A) Нарезание резьбы резьбовым инструментом на станке;</w:t>
+        <w:br/>
+        <w:t>B) Точение цилиндрических поверхностей деталей;</w:t>
+        <w:br/>
+        <w:t>C) Протягивание шпоночных пазов протяжкой;</w:t>
+        <w:br/>
+        <w:t>D) Фрезерование плоскостей, пазов и фасонных поверхностей.</w:t>
       </w:r>
     </w:p>
     <w:p>
@@ -2674,13 +2674,13 @@
         </w:rPr>
         <w:t>16. Какой параметр режима резания определяет толщину срезаемого слоя?</w:t>
         <w:br/>
-        <w:t>A) Скорость резания;</w:t>
-        <w:br/>
-        <w:t>B) Подача и глубина резания;</w:t>
-        <w:br/>
-        <w:t>C) Угол резца;</w:t>
-        <w:br/>
-        <w:t>D) Материал заготовки.</w:t>
+        <w:t>A) Скорость резания при механической обработке;</w:t>
+        <w:br/>
+        <w:t>B) Подача (величина перемещения инструмента за оборот);</w:t>
+        <w:br/>
+        <w:t>C) Материал заготовки и его физические свойства;</w:t>
+        <w:br/>
+        <w:t>D) Угол резца, определяющий геометрию режущей части.</w:t>
       </w:r>
     </w:p>
     <w:p>
@@ -2697,11 +2697,11 @@
         <w:br/>
         <w:t>A) Штангенциркуль;</w:t>
         <w:br/>
-        <w:t>B) Нутромер;</w:t>
-        <w:br/>
-        <w:t>C) Микрометр;</w:t>
-        <w:br/>
-        <w:t>D) Линейка.</w:t>
+        <w:t>B) Микрометр;</w:t>
+        <w:br/>
+        <w:t>C) Линейка;</w:t>
+        <w:br/>
+        <w:t>D) Нутромер.</w:t>
       </w:r>
     </w:p>
     <w:p>
@@ -2714,15 +2714,15 @@
           <w:rFonts w:ascii="Times New Roman" w:hAnsi="Times New Roman" w:eastAsia="Times New Roman"/>
           <w:sz w:val="28"/>
         </w:rPr>
-        <w:t>18. Какое приспособление применяется для закрепления заготовки на фрезерном станке?</w:t>
-        <w:br/>
-        <w:t>A) Патрон;</w:t>
-        <w:br/>
-        <w:t>B) Тиски станочные;</w:t>
-        <w:br/>
-        <w:t>C) Центры;</w:t>
-        <w:br/>
-        <w:t>D) Люнет.</w:t>
+        <w:t>18. Какое приспособление применяется для закрепления заготовки при фрезерной обработке?</w:t>
+        <w:br/>
+        <w:t>A) Патрон токарный трёхкулачковый;</w:t>
+        <w:br/>
+        <w:t>B) Центр вращающийся с коническим наконечником;</w:t>
+        <w:br/>
+        <w:t>C) Люнет подвижный с регулировочным винтом;</w:t>
+        <w:br/>
+        <w:t>D) Тиски станочные.</w:t>
       </w:r>
     </w:p>
     <w:p>
@@ -2737,13 +2737,13 @@
         </w:rPr>
         <w:t>19. К какому типу производства относится профессия оператора автоматических и полуавтоматических станков?</w:t>
         <w:br/>
-        <w:t>A) Сельскохозяйственное;</w:t>
+        <w:t>A) Сельскохозяйственное производство;</w:t>
         <w:br/>
         <w:t>B) Машиностроительное (металлообрабатывающее);</w:t>
         <w:br/>
-        <w:t>C) Пищевое;</w:t>
-        <w:br/>
-        <w:t>D) Строительное.</w:t>
+        <w:t>C) Строительное производство стройматериалов;</w:t>
+        <w:br/>
+        <w:t>D) Пищевое производство продуктов питания.</w:t>
       </w:r>
     </w:p>
     <w:p>
@@ -2760,9 +2760,9 @@
         <w:br/>
         <w:t>A) IT5;</w:t>
         <w:br/>
-        <w:t>B) IT7;</w:t>
-        <w:br/>
-        <w:t>C) IT12;</w:t>
+        <w:t>B) IT12;</w:t>
+        <w:br/>
+        <w:t>C) IT7;</w:t>
         <w:br/>
         <w:t>D) IT3.</w:t>
       </w:r>
@@ -3715,6 +3715,44 @@
                 <w:b w:val="0"/>
                 <w:sz w:val="28"/>
               </w:rPr>
+              <w:t>B</w:t>
+            </w:r>
+          </w:p>
+        </w:tc>
+        <w:tc>
+          <w:tcPr>
+            <w:tcW w:type="dxa" w:w="411"/>
+          </w:tcPr>
+          <w:p>
+            <w:pPr>
+              <w:jc w:val="center"/>
+            </w:pPr>
+            <w:r/>
+            <w:r>
+              <w:rPr>
+                <w:rFonts w:ascii="Times New Roman" w:hAnsi="Times New Roman" w:eastAsia="Times New Roman"/>
+                <w:b w:val="0"/>
+                <w:sz w:val="28"/>
+              </w:rPr>
+              <w:t>D</w:t>
+            </w:r>
+          </w:p>
+        </w:tc>
+        <w:tc>
+          <w:tcPr>
+            <w:tcW w:type="dxa" w:w="411"/>
+          </w:tcPr>
+          <w:p>
+            <w:pPr>
+              <w:jc w:val="center"/>
+            </w:pPr>
+            <w:r/>
+            <w:r>
+              <w:rPr>
+                <w:rFonts w:ascii="Times New Roman" w:hAnsi="Times New Roman" w:eastAsia="Times New Roman"/>
+                <w:b w:val="0"/>
+                <w:sz w:val="28"/>
+              </w:rPr>
               <w:t>A</w:t>
             </w:r>
           </w:p>
@@ -3753,45 +3791,7 @@
                 <w:b w:val="0"/>
                 <w:sz w:val="28"/>
               </w:rPr>
-              <w:t>B</w:t>
-            </w:r>
-          </w:p>
-        </w:tc>
-        <w:tc>
-          <w:tcPr>
-            <w:tcW w:type="dxa" w:w="411"/>
-          </w:tcPr>
-          <w:p>
-            <w:pPr>
-              <w:jc w:val="center"/>
-            </w:pPr>
-            <w:r/>
-            <w:r>
-              <w:rPr>
-                <w:rFonts w:ascii="Times New Roman" w:hAnsi="Times New Roman" w:eastAsia="Times New Roman"/>
-                <w:b w:val="0"/>
-                <w:sz w:val="28"/>
-              </w:rPr>
-              <w:t>B</w:t>
-            </w:r>
-          </w:p>
-        </w:tc>
-        <w:tc>
-          <w:tcPr>
-            <w:tcW w:type="dxa" w:w="411"/>
-          </w:tcPr>
-          <w:p>
-            <w:pPr>
-              <w:jc w:val="center"/>
-            </w:pPr>
-            <w:r/>
-            <w:r>
-              <w:rPr>
-                <w:rFonts w:ascii="Times New Roman" w:hAnsi="Times New Roman" w:eastAsia="Times New Roman"/>
-                <w:b w:val="0"/>
-                <w:sz w:val="28"/>
-              </w:rPr>
-              <w:t>B</w:t>
+              <w:t>D</w:t>
             </w:r>
           </w:p>
         </w:tc>
@@ -3886,7 +3886,7 @@
                 <w:b w:val="0"/>
                 <w:sz w:val="28"/>
               </w:rPr>
-              <w:t>B</w:t>
+              <w:t>A</w:t>
             </w:r>
           </w:p>
         </w:tc>
@@ -3905,7 +3905,7 @@
                 <w:b w:val="0"/>
                 <w:sz w:val="28"/>
               </w:rPr>
-              <w:t>B</w:t>
+              <w:t>D</w:t>
             </w:r>
           </w:p>
         </w:tc>
@@ -3924,7 +3924,7 @@
                 <w:b w:val="0"/>
                 <w:sz w:val="28"/>
               </w:rPr>
-              <w:t>B</w:t>
+              <w:t>A</w:t>
             </w:r>
           </w:p>
         </w:tc>
@@ -3962,7 +3962,7 @@
                 <w:b w:val="0"/>
                 <w:sz w:val="28"/>
               </w:rPr>
-              <w:t>B</w:t>
+              <w:t>D</w:t>
             </w:r>
           </w:p>
         </w:tc>
@@ -4000,7 +4000,7 @@
                 <w:b w:val="0"/>
                 <w:sz w:val="28"/>
               </w:rPr>
-              <w:t>B</w:t>
+              <w:t>A</w:t>
             </w:r>
           </w:p>
         </w:tc>
@@ -4019,7 +4019,7 @@
                 <w:b w:val="0"/>
                 <w:sz w:val="28"/>
               </w:rPr>
-              <w:t>B</w:t>
+              <w:t>D</w:t>
             </w:r>
           </w:p>
         </w:tc>
@@ -4097,44 +4097,6 @@
                 <w:b w:val="0"/>
                 <w:sz w:val="28"/>
               </w:rPr>
-              <w:t>B</w:t>
-            </w:r>
-          </w:p>
-        </w:tc>
-        <w:tc>
-          <w:tcPr>
-            <w:tcW w:type="dxa" w:w="411"/>
-          </w:tcPr>
-          <w:p>
-            <w:pPr>
-              <w:jc w:val="center"/>
-            </w:pPr>
-            <w:r/>
-            <w:r>
-              <w:rPr>
-                <w:rFonts w:ascii="Times New Roman" w:hAnsi="Times New Roman" w:eastAsia="Times New Roman"/>
-                <w:b w:val="0"/>
-                <w:sz w:val="28"/>
-              </w:rPr>
-              <w:t>B</w:t>
-            </w:r>
-          </w:p>
-        </w:tc>
-        <w:tc>
-          <w:tcPr>
-            <w:tcW w:type="dxa" w:w="411"/>
-          </w:tcPr>
-          <w:p>
-            <w:pPr>
-              <w:jc w:val="center"/>
-            </w:pPr>
-            <w:r/>
-            <w:r>
-              <w:rPr>
-                <w:rFonts w:ascii="Times New Roman" w:hAnsi="Times New Roman" w:eastAsia="Times New Roman"/>
-                <w:b w:val="0"/>
-                <w:sz w:val="28"/>
-              </w:rPr>
               <w:t>A</w:t>
             </w:r>
           </w:p>
@@ -4192,6 +4154,63 @@
                 <w:b w:val="0"/>
                 <w:sz w:val="28"/>
               </w:rPr>
+              <w:t>C</w:t>
+            </w:r>
+          </w:p>
+        </w:tc>
+        <w:tc>
+          <w:tcPr>
+            <w:tcW w:type="dxa" w:w="411"/>
+          </w:tcPr>
+          <w:p>
+            <w:pPr>
+              <w:jc w:val="center"/>
+            </w:pPr>
+            <w:r/>
+            <w:r>
+              <w:rPr>
+                <w:rFonts w:ascii="Times New Roman" w:hAnsi="Times New Roman" w:eastAsia="Times New Roman"/>
+                <w:b w:val="0"/>
+                <w:sz w:val="28"/>
+              </w:rPr>
+              <w:t>C</w:t>
+            </w:r>
+          </w:p>
+        </w:tc>
+        <w:tc>
+          <w:tcPr>
+            <w:tcW w:type="dxa" w:w="411"/>
+          </w:tcPr>
+          <w:p>
+            <w:pPr>
+              <w:jc w:val="center"/>
+            </w:pPr>
+            <w:r/>
+            <w:r>
+              <w:rPr>
+                <w:rFonts w:ascii="Times New Roman" w:hAnsi="Times New Roman" w:eastAsia="Times New Roman"/>
+                <w:b w:val="0"/>
+                <w:sz w:val="28"/>
+              </w:rPr>
+              <w:t>A</w:t>
+            </w:r>
+          </w:p>
+        </w:tc>
+        <w:tc>
+          <w:tcPr>
+            <w:tcW w:type="dxa" w:w="411"/>
+          </w:tcPr>
+          <w:p>
+            <w:pPr>
+              <w:jc w:val="center"/>
+            </w:pPr>
+            <w:r/>
+            <w:r>
+              <w:rPr>
+                <w:rFonts w:ascii="Times New Roman" w:hAnsi="Times New Roman" w:eastAsia="Times New Roman"/>
+                <w:b w:val="0"/>
+                <w:sz w:val="28"/>
+              </w:rPr>
               <w:t>A</w:t>
             </w:r>
           </w:p>
@@ -4230,7 +4249,7 @@
                 <w:b w:val="0"/>
                 <w:sz w:val="28"/>
               </w:rPr>
-              <w:t>B</w:t>
+              <w:t>D</w:t>
             </w:r>
           </w:p>
         </w:tc>
@@ -4249,7 +4268,7 @@
                 <w:b w:val="0"/>
                 <w:sz w:val="28"/>
               </w:rPr>
-              <w:t>B</w:t>
+              <w:t>A</w:t>
             </w:r>
           </w:p>
         </w:tc>
@@ -4268,7 +4287,7 @@
                 <w:b w:val="0"/>
                 <w:sz w:val="28"/>
               </w:rPr>
-              <w:t>B</w:t>
+              <w:t>D</w:t>
             </w:r>
           </w:p>
         </w:tc>
@@ -4287,26 +4306,7 @@
                 <w:b w:val="0"/>
                 <w:sz w:val="28"/>
               </w:rPr>
-              <w:t>B</w:t>
-            </w:r>
-          </w:p>
-        </w:tc>
-        <w:tc>
-          <w:tcPr>
-            <w:tcW w:type="dxa" w:w="411"/>
-          </w:tcPr>
-          <w:p>
-            <w:pPr>
-              <w:jc w:val="center"/>
-            </w:pPr>
-            <w:r/>
-            <w:r>
-              <w:rPr>
-                <w:rFonts w:ascii="Times New Roman" w:hAnsi="Times New Roman" w:eastAsia="Times New Roman"/>
-                <w:b w:val="0"/>
-                <w:sz w:val="28"/>
-              </w:rPr>
-              <w:t>B</w:t>
+              <w:t>A</w:t>
             </w:r>
           </w:p>
         </w:tc>
@@ -4420,7 +4420,7 @@
                 <w:b w:val="0"/>
                 <w:sz w:val="28"/>
               </w:rPr>
-              <w:t>B</w:t>
+              <w:t>D</w:t>
             </w:r>
           </w:p>
         </w:tc>
@@ -4439,7 +4439,7 @@
                 <w:b w:val="0"/>
                 <w:sz w:val="28"/>
               </w:rPr>
-              <w:t>B</w:t>
+              <w:t>D</w:t>
             </w:r>
           </w:p>
         </w:tc>
@@ -4458,7 +4458,7 @@
                 <w:b w:val="0"/>
                 <w:sz w:val="28"/>
               </w:rPr>
-              <w:t>B</w:t>
+              <w:t>D</w:t>
             </w:r>
           </w:p>
         </w:tc>
@@ -4517,7 +4517,7 @@
                 <w:b w:val="0"/>
                 <w:sz w:val="28"/>
               </w:rPr>
-              <w:t>B</w:t>
+              <w:t>A</w:t>
             </w:r>
           </w:p>
         </w:tc>
@@ -4555,45 +4555,7 @@
                 <w:b w:val="0"/>
                 <w:sz w:val="28"/>
               </w:rPr>
-              <w:t>B</w:t>
-            </w:r>
-          </w:p>
-        </w:tc>
-        <w:tc>
-          <w:tcPr>
-            <w:tcW w:type="dxa" w:w="411"/>
-          </w:tcPr>
-          <w:p>
-            <w:pPr>
-              <w:jc w:val="center"/>
-            </w:pPr>
-            <w:r/>
-            <w:r>
-              <w:rPr>
-                <w:rFonts w:ascii="Times New Roman" w:hAnsi="Times New Roman" w:eastAsia="Times New Roman"/>
-                <w:b w:val="0"/>
-                <w:sz w:val="28"/>
-              </w:rPr>
-              <w:t>B</w:t>
-            </w:r>
-          </w:p>
-        </w:tc>
-        <w:tc>
-          <w:tcPr>
-            <w:tcW w:type="dxa" w:w="411"/>
-          </w:tcPr>
-          <w:p>
-            <w:pPr>
-              <w:jc w:val="center"/>
-            </w:pPr>
-            <w:r/>
-            <w:r>
-              <w:rPr>
-                <w:rFonts w:ascii="Times New Roman" w:hAnsi="Times New Roman" w:eastAsia="Times New Roman"/>
-                <w:b w:val="0"/>
-                <w:sz w:val="28"/>
-              </w:rPr>
-              <w:t>C</w:t>
+              <w:t>D</w:t>
             </w:r>
           </w:p>
         </w:tc>
@@ -4669,7 +4631,7 @@
                 <w:b w:val="0"/>
                 <w:sz w:val="28"/>
               </w:rPr>
-              <w:t>B</w:t>
+              <w:t>C</w:t>
             </w:r>
           </w:p>
         </w:tc>
@@ -4688,7 +4650,64 @@
                 <w:b w:val="0"/>
                 <w:sz w:val="28"/>
               </w:rPr>
-              <w:t>B</w:t>
+              <w:t>A</w:t>
+            </w:r>
+          </w:p>
+        </w:tc>
+        <w:tc>
+          <w:tcPr>
+            <w:tcW w:type="dxa" w:w="411"/>
+          </w:tcPr>
+          <w:p>
+            <w:pPr>
+              <w:jc w:val="center"/>
+            </w:pPr>
+            <w:r/>
+            <w:r>
+              <w:rPr>
+                <w:rFonts w:ascii="Times New Roman" w:hAnsi="Times New Roman" w:eastAsia="Times New Roman"/>
+                <w:b w:val="0"/>
+                <w:sz w:val="28"/>
+              </w:rPr>
+              <w:t>A</w:t>
+            </w:r>
+          </w:p>
+        </w:tc>
+        <w:tc>
+          <w:tcPr>
+            <w:tcW w:type="dxa" w:w="411"/>
+          </w:tcPr>
+          <w:p>
+            <w:pPr>
+              <w:jc w:val="center"/>
+            </w:pPr>
+            <w:r/>
+            <w:r>
+              <w:rPr>
+                <w:rFonts w:ascii="Times New Roman" w:hAnsi="Times New Roman" w:eastAsia="Times New Roman"/>
+                <w:b w:val="0"/>
+                <w:sz w:val="28"/>
+              </w:rPr>
+              <w:t>D</w:t>
+            </w:r>
+          </w:p>
+        </w:tc>
+        <w:tc>
+          <w:tcPr>
+            <w:tcW w:type="dxa" w:w="411"/>
+          </w:tcPr>
+          <w:p>
+            <w:pPr>
+              <w:jc w:val="center"/>
+            </w:pPr>
+            <w:r/>
+            <w:r>
+              <w:rPr>
+                <w:rFonts w:ascii="Times New Roman" w:hAnsi="Times New Roman" w:eastAsia="Times New Roman"/>
+                <w:b w:val="0"/>
+                <w:sz w:val="28"/>
+              </w:rPr>
+              <w:t>C</w:t>
             </w:r>
           </w:p>
         </w:tc>
@@ -4745,7 +4764,64 @@
                 <w:b w:val="0"/>
                 <w:sz w:val="28"/>
               </w:rPr>
-              <w:t>C</w:t>
+              <w:t>D</w:t>
+            </w:r>
+          </w:p>
+        </w:tc>
+        <w:tc>
+          <w:tcPr>
+            <w:tcW w:type="dxa" w:w="411"/>
+          </w:tcPr>
+          <w:p>
+            <w:pPr>
+              <w:jc w:val="center"/>
+            </w:pPr>
+            <w:r/>
+            <w:r>
+              <w:rPr>
+                <w:rFonts w:ascii="Times New Roman" w:hAnsi="Times New Roman" w:eastAsia="Times New Roman"/>
+                <w:b w:val="0"/>
+                <w:sz w:val="28"/>
+              </w:rPr>
+              <w:t>B</w:t>
+            </w:r>
+          </w:p>
+        </w:tc>
+        <w:tc>
+          <w:tcPr>
+            <w:tcW w:type="dxa" w:w="411"/>
+          </w:tcPr>
+          <w:p>
+            <w:pPr>
+              <w:jc w:val="center"/>
+            </w:pPr>
+            <w:r/>
+            <w:r>
+              <w:rPr>
+                <w:rFonts w:ascii="Times New Roman" w:hAnsi="Times New Roman" w:eastAsia="Times New Roman"/>
+                <w:b w:val="0"/>
+                <w:sz w:val="28"/>
+              </w:rPr>
+              <w:t>D</w:t>
+            </w:r>
+          </w:p>
+        </w:tc>
+        <w:tc>
+          <w:tcPr>
+            <w:tcW w:type="dxa" w:w="411"/>
+          </w:tcPr>
+          <w:p>
+            <w:pPr>
+              <w:jc w:val="center"/>
+            </w:pPr>
+            <w:r/>
+            <w:r>
+              <w:rPr>
+                <w:rFonts w:ascii="Times New Roman" w:hAnsi="Times New Roman" w:eastAsia="Times New Roman"/>
+                <w:b w:val="0"/>
+                <w:sz w:val="28"/>
+              </w:rPr>
+              <w:t>D</w:t>
             </w:r>
           </w:p>
         </w:tc>
@@ -4784,82 +4860,6 @@
                 <w:sz w:val="28"/>
               </w:rPr>
               <w:t>B</w:t>
-            </w:r>
-          </w:p>
-        </w:tc>
-        <w:tc>
-          <w:tcPr>
-            <w:tcW w:type="dxa" w:w="411"/>
-          </w:tcPr>
-          <w:p>
-            <w:pPr>
-              <w:jc w:val="center"/>
-            </w:pPr>
-            <w:r/>
-            <w:r>
-              <w:rPr>
-                <w:rFonts w:ascii="Times New Roman" w:hAnsi="Times New Roman" w:eastAsia="Times New Roman"/>
-                <w:b w:val="0"/>
-                <w:sz w:val="28"/>
-              </w:rPr>
-              <w:t>B</w:t>
-            </w:r>
-          </w:p>
-        </w:tc>
-        <w:tc>
-          <w:tcPr>
-            <w:tcW w:type="dxa" w:w="411"/>
-          </w:tcPr>
-          <w:p>
-            <w:pPr>
-              <w:jc w:val="center"/>
-            </w:pPr>
-            <w:r/>
-            <w:r>
-              <w:rPr>
-                <w:rFonts w:ascii="Times New Roman" w:hAnsi="Times New Roman" w:eastAsia="Times New Roman"/>
-                <w:b w:val="0"/>
-                <w:sz w:val="28"/>
-              </w:rPr>
-              <w:t>B</w:t>
-            </w:r>
-          </w:p>
-        </w:tc>
-        <w:tc>
-          <w:tcPr>
-            <w:tcW w:type="dxa" w:w="411"/>
-          </w:tcPr>
-          <w:p>
-            <w:pPr>
-              <w:jc w:val="center"/>
-            </w:pPr>
-            <w:r/>
-            <w:r>
-              <w:rPr>
-                <w:rFonts w:ascii="Times New Roman" w:hAnsi="Times New Roman" w:eastAsia="Times New Roman"/>
-                <w:b w:val="0"/>
-                <w:sz w:val="28"/>
-              </w:rPr>
-              <w:t>B</w:t>
-            </w:r>
-          </w:p>
-        </w:tc>
-        <w:tc>
-          <w:tcPr>
-            <w:tcW w:type="dxa" w:w="411"/>
-          </w:tcPr>
-          <w:p>
-            <w:pPr>
-              <w:jc w:val="center"/>
-            </w:pPr>
-            <w:r/>
-            <w:r>
-              <w:rPr>
-                <w:rFonts w:ascii="Times New Roman" w:hAnsi="Times New Roman" w:eastAsia="Times New Roman"/>
-                <w:b w:val="0"/>
-                <w:sz w:val="28"/>
-              </w:rPr>
-              <w:t>C</w:t>
             </w:r>
           </w:p>
         </w:tc>

</xml_diff>